<commit_message>
feat: фаза 1.6 — playwright e2e + visual regression baseline (threshold 5%)
</commit_message>
<xml_diff>
--- a/templates/kp_template.docx
+++ b/templates/kp_template.docx
@@ -38,7 +38,13 @@
         </w:rPr>
         <w:t>Коммерческое предложение № {{ kp_number }} от {{ kp_date }}</w:t>
         <w:br/>
-        <w:t>на поставку автомобильных весов ВЕСТА</w:t>
+        <w:t xml:space="preserve">на поставку автомобильных весов </w:t>
+      </w:r>
+      <w:r>
+        <w:rPr>
+          <w:color w:val="D04514"/>
+        </w:rPr>
+        <w:t>ВЕСТА</w:t>
       </w:r>
       <w:bookmarkEnd w:id="0"/>
       <w:bookmarkEnd w:id="1"/>
@@ -2471,11 +2477,7 @@
       <w:bookmarkStart w:id="4" w:name="_Toc195437189"/>
       <w:bookmarkStart w:id="5" w:name="_Toc70304468"/>
       <w:r>
-        <w:lastRenderedPageBreak/>
-        <w:t>Характеристики</w:t>
-      </w:r>
-      <w:r>
-        <w:t xml:space="preserve"> ВЕСТА</w:t>
+        <w:t>Характеристики {{ model_full_name }}</w:t>
       </w:r>
       <w:bookmarkEnd w:id="4"/>
     </w:p>
@@ -2603,138 +2605,11 @@
                 <w:szCs w:val="22"/>
                 <w:lang w:val="ru-RU"/>
               </w:rPr>
-              <w:t xml:space="preserve">Рабочий диапазон температур, </w:t>
-            </w:r>
-            <w:r>
-              <w:rPr>
-                <w:rFonts w:ascii="PT Sans" w:hAnsi="PT Sans" w:cstheme="minorHAnsi"/>
-                <w:color w:val="000000"/>
-                <w:sz w:val="22"/>
-                <w:szCs w:val="22"/>
-              </w:rPr>
-              <w:sym w:font="Symbol" w:char="00B0"/>
-            </w:r>
-            <w:r>
-              <w:rPr>
-                <w:rFonts w:ascii="PT Sans" w:hAnsi="PT Sans" w:cstheme="minorHAnsi"/>
-                <w:color w:val="000000"/>
-                <w:sz w:val="22"/>
-                <w:szCs w:val="22"/>
-                <w:lang w:val="ru-RU"/>
-              </w:rPr>
-              <w:t>С:</w:t>
-            </w:r>
-          </w:p>
-          <w:p>
-            <w:pPr>
-              <w:rPr>
-                <w:rFonts w:ascii="PT Sans" w:hAnsi="PT Sans" w:cstheme="minorHAnsi"/>
-                <w:color w:val="000000"/>
-                <w:sz w:val="22"/>
-                <w:szCs w:val="22"/>
-                <w:lang w:val="ru-RU"/>
-              </w:rPr>
-            </w:pPr>
-            <w:r>
-              <w:rPr>
-                <w:rFonts w:ascii="PT Sans" w:hAnsi="PT Sans" w:cstheme="minorHAnsi"/>
-                <w:color w:val="000000"/>
-                <w:sz w:val="22"/>
-                <w:szCs w:val="22"/>
-                <w:lang w:val="ru-RU"/>
-              </w:rPr>
-              <w:t xml:space="preserve">- для </w:t>
-            </w:r>
-            <w:r>
-              <w:rPr>
-                <w:rFonts w:ascii="PT Sans" w:hAnsi="PT Sans" w:cstheme="minorHAnsi"/>
-                <w:color w:val="000000"/>
-                <w:sz w:val="22"/>
-                <w:szCs w:val="22"/>
-                <w:lang w:val="ru-RU"/>
-              </w:rPr>
-              <w:t>Тензо</w:t>
-            </w:r>
-            <w:r>
-              <w:rPr>
-                <w:rFonts w:ascii="PT Sans" w:hAnsi="PT Sans" w:cstheme="minorHAnsi"/>
-                <w:color w:val="000000"/>
-                <w:sz w:val="22"/>
-                <w:szCs w:val="22"/>
-                <w:lang w:val="ru-RU"/>
-              </w:rPr>
-              <w:t>датчиков</w:t>
-            </w:r>
-          </w:p>
-          <w:p>
-            <w:pPr>
-              <w:rPr>
-                <w:rFonts w:ascii="PT Sans" w:hAnsi="PT Sans" w:cstheme="minorHAnsi"/>
-                <w:color w:val="000000"/>
-                <w:sz w:val="22"/>
-                <w:szCs w:val="22"/>
-                <w:lang w:val="ru-RU"/>
-              </w:rPr>
-            </w:pPr>
-            <w:r>
-              <w:rPr>
-                <w:rFonts w:ascii="PT Sans" w:hAnsi="PT Sans" w:cstheme="minorHAnsi"/>
-                <w:color w:val="000000"/>
-                <w:sz w:val="22"/>
-                <w:szCs w:val="22"/>
-                <w:lang w:val="ru-RU"/>
-              </w:rPr>
-              <w:t xml:space="preserve">- для </w:t>
-            </w:r>
-            <w:r>
-              <w:rPr>
-                <w:rFonts w:ascii="PT Sans" w:hAnsi="PT Sans" w:cstheme="minorHAnsi"/>
-                <w:color w:val="000000"/>
-                <w:sz w:val="22"/>
-                <w:szCs w:val="22"/>
-                <w:lang w:val="ru-RU"/>
-              </w:rPr>
-              <w:t>В</w:t>
-            </w:r>
-            <w:r>
-              <w:rPr>
-                <w:rFonts w:ascii="PT Sans" w:hAnsi="PT Sans" w:cstheme="minorHAnsi"/>
-                <w:color w:val="000000"/>
-                <w:sz w:val="22"/>
-                <w:szCs w:val="22"/>
-                <w:lang w:val="ru-RU"/>
-              </w:rPr>
-              <w:t xml:space="preserve">есового </w:t>
-            </w:r>
-            <w:r>
-              <w:rPr>
-                <w:rFonts w:ascii="PT Sans" w:hAnsi="PT Sans" w:cstheme="minorHAnsi"/>
-                <w:color w:val="000000"/>
-                <w:sz w:val="22"/>
-                <w:szCs w:val="22"/>
-                <w:lang w:val="ru-RU"/>
-              </w:rPr>
-              <w:t>индикатора (</w:t>
-            </w:r>
-            <w:r>
-              <w:rPr>
-                <w:rFonts w:ascii="PT Sans" w:hAnsi="PT Sans" w:cstheme="minorHAnsi"/>
-                <w:color w:val="000000"/>
-                <w:sz w:val="22"/>
-                <w:szCs w:val="22"/>
-                <w:lang w:val="ru-RU"/>
-              </w:rPr>
-              <w:t>терминала</w:t>
-            </w:r>
-            <w:r>
-              <w:rPr>
-                <w:rFonts w:ascii="PT Sans" w:hAnsi="PT Sans" w:cstheme="minorHAnsi"/>
-                <w:color w:val="000000"/>
-                <w:sz w:val="22"/>
-                <w:szCs w:val="22"/>
-                <w:lang w:val="ru-RU"/>
-              </w:rPr>
-              <w:t>)</w:t>
+              <w:t>Рабочий диапазон температур, °С:</w:t>
+              <w:br/>
+              <w:t xml:space="preserve">- для Тензодатчиков {{ sensor_label }}</w:t>
+              <w:br/>
+              <w:t xml:space="preserve">- для Весового индикатора (терминала) {{ indicator_label }}</w:t>
             </w:r>
           </w:p>
         </w:tc>
@@ -2759,114 +2634,10 @@
                 <w:lang w:val="ru-RU"/>
               </w:rPr>
             </w:pPr>
-          </w:p>
-          <w:p>
-            <w:pPr>
-              <w:jc w:val="center"/>
-              <w:rPr>
-                <w:rFonts w:ascii="PT Sans" w:hAnsi="PT Sans" w:cstheme="minorHAnsi"/>
-                <w:color w:val="000000"/>
-                <w:sz w:val="22"/>
-                <w:szCs w:val="22"/>
-                <w:lang w:val="ru-RU"/>
-              </w:rPr>
-            </w:pPr>
-            <w:r>
-              <w:rPr>
-                <w:rFonts w:ascii="PT Sans" w:hAnsi="PT Sans" w:cstheme="minorHAnsi"/>
-                <w:color w:val="000000"/>
-                <w:sz w:val="22"/>
-                <w:szCs w:val="22"/>
-                <w:lang w:val="ru-RU"/>
-              </w:rPr>
-              <w:t>-</w:t>
-            </w:r>
-            <w:r>
-              <w:rPr>
-                <w:rFonts w:ascii="PT Sans" w:hAnsi="PT Sans" w:cstheme="minorHAnsi"/>
-                <w:color w:val="000000"/>
-                <w:sz w:val="22"/>
-                <w:szCs w:val="22"/>
-                <w:lang w:val="ru-RU"/>
-              </w:rPr>
-              <w:t>30</w:t>
-            </w:r>
-            <w:r>
-              <w:rPr>
-                <w:rFonts w:ascii="PT Sans" w:hAnsi="PT Sans" w:cstheme="minorHAnsi"/>
-                <w:color w:val="000000"/>
-                <w:sz w:val="22"/>
-                <w:szCs w:val="22"/>
-                <w:lang w:val="ru-RU"/>
-              </w:rPr>
-              <w:t>…</w:t>
-            </w:r>
-            <w:r>
-              <w:rPr>
-                <w:rFonts w:ascii="PT Sans" w:hAnsi="PT Sans" w:cstheme="minorHAnsi"/>
-                <w:color w:val="000000"/>
-                <w:sz w:val="22"/>
-                <w:szCs w:val="22"/>
-                <w:lang w:val="ru-RU"/>
-              </w:rPr>
-              <w:t>+40</w:t>
-            </w:r>
-          </w:p>
-          <w:p>
-            <w:pPr>
-              <w:jc w:val="center"/>
-              <w:rPr>
-                <w:rFonts w:ascii="PT Sans" w:hAnsi="PT Sans" w:cstheme="minorHAnsi"/>
-                <w:color w:val="000000"/>
-                <w:sz w:val="22"/>
-                <w:szCs w:val="22"/>
-                <w:lang w:val="ru-RU"/>
-              </w:rPr>
-            </w:pPr>
-            <w:r>
-              <w:rPr>
-                <w:rFonts w:ascii="PT Sans" w:hAnsi="PT Sans" w:cstheme="minorHAnsi"/>
-                <w:sz w:val="22"/>
-                <w:szCs w:val="22"/>
-                <w:lang w:val="ru-RU"/>
-              </w:rPr>
-              <w:t>-</w:t>
-            </w:r>
-            <w:r>
-              <w:rPr>
-                <w:rFonts w:ascii="PT Sans" w:hAnsi="PT Sans" w:cstheme="minorHAnsi"/>
-                <w:sz w:val="22"/>
-                <w:szCs w:val="22"/>
-                <w:lang w:val="ru-RU"/>
-              </w:rPr>
-              <w:t>0</w:t>
-            </w:r>
-            <w:r>
-              <w:rPr>
-                <w:rFonts w:ascii="PT Sans" w:hAnsi="PT Sans" w:cstheme="minorHAnsi"/>
-                <w:sz w:val="22"/>
-                <w:szCs w:val="22"/>
-                <w:lang w:val="ru-RU"/>
-              </w:rPr>
-              <w:t>…+</w:t>
-            </w:r>
-            <w:r>
-              <w:rPr>
-                <w:rFonts w:ascii="PT Sans" w:hAnsi="PT Sans" w:cstheme="minorHAnsi"/>
-                <w:sz w:val="22"/>
-                <w:szCs w:val="22"/>
-                <w:lang w:val="ru-RU"/>
-              </w:rPr>
-              <w:t>4</w:t>
-            </w:r>
-            <w:r>
-              <w:rPr>
-                <w:rFonts w:ascii="PT Sans" w:hAnsi="PT Sans" w:cstheme="minorHAnsi"/>
-                <w:sz w:val="22"/>
-                <w:szCs w:val="22"/>
-                <w:lang w:val="ru-RU"/>
-              </w:rPr>
-              <w:t>0</w:t>
+            <w:r>
+              <w:t>{{ sensor_temp_range }}</w:t>
+              <w:br/>
+              <w:t xml:space="preserve">{{ indicator_temp_range }}</w:t>
             </w:r>
           </w:p>
         </w:tc>
@@ -3864,9 +3635,7 @@
                 <w:szCs w:val="22"/>
               </w:rPr>
             </w:pPr>
-            <w:r>
-              <w:t>{{ division_info }}</w:t>
-            </w:r>
+            <w:r/>
           </w:p>
         </w:tc>
       </w:tr>
@@ -3895,7 +3664,7 @@
               </w:rPr>
             </w:pPr>
             <w:r>
-              <w:t>{{ max_load_t }}</w:t>
+              <w:t>Максимальная нагрузка, т</w:t>
             </w:r>
           </w:p>
         </w:tc>
@@ -3926,7 +3695,7 @@
                 <w:sz w:val="22"/>
                 <w:szCs w:val="22"/>
               </w:rPr>
-              <w:t>80</w:t>
+              <w:t>{{ max_load_t }}</w:t>
             </w:r>
           </w:p>
         </w:tc>
@@ -3964,7 +3733,7 @@
                 <w:szCs w:val="22"/>
                 <w:lang w:val="ru-RU"/>
               </w:rPr>
-              <w:t>{{ main_scale_label }}</w:t>
+              <w:t>Цена поверочного деления:</w:t>
             </w:r>
           </w:p>
         </w:tc>
@@ -3997,36 +3766,7 @@
                 <w:szCs w:val="22"/>
                 <w:lang w:val="ru-RU"/>
               </w:rPr>
-              <w:t>20 до 60т</w:t>
-            </w:r>
-            <w:r>
-              <w:rPr>
-                <w:rFonts w:ascii="PT Sans" w:hAnsi="PT Sans" w:cstheme="minorHAnsi"/>
-                <w:color w:val="000000"/>
-                <w:sz w:val="22"/>
-                <w:szCs w:val="22"/>
-                <w:lang w:val="ru-RU"/>
-              </w:rPr>
-              <w:br/>
-            </w:r>
-            <w:r>
-              <w:rPr>
-                <w:rFonts w:ascii="PT Sans" w:hAnsi="PT Sans" w:cstheme="minorHAnsi"/>
-                <w:color w:val="000000"/>
-                <w:sz w:val="22"/>
-                <w:szCs w:val="22"/>
-              </w:rPr>
-              <w:t>50</w:t>
-            </w:r>
-            <w:r>
-              <w:rPr>
-                <w:rFonts w:ascii="PT Sans" w:hAnsi="PT Sans" w:cstheme="minorHAnsi"/>
-                <w:color w:val="000000"/>
-                <w:sz w:val="22"/>
-                <w:szCs w:val="22"/>
-                <w:lang w:val="ru-RU"/>
-              </w:rPr>
-              <w:t xml:space="preserve"> от 60т до 80т</w:t>
+              <w:t>{{ main_scale_label }}</w:t>
             </w:r>
           </w:p>
         </w:tc>
@@ -4775,6 +4515,13 @@
               </w:rPr>
             </w:pPr>
             <w:r>
+              <w:rPr>
+                <w:rFonts w:ascii="PT Sans" w:hAnsi="PT Sans" w:cstheme="minorHAnsi"/>
+                <w:color w:val="000000" w:themeColor="text1"/>
+                <w:sz w:val="22"/>
+                <w:szCs w:val="22"/>
+                <w:lang w:val="ru-RU"/>
+              </w:rPr>
               <w:t>{%tr for item in spec_items %}</w:t>
             </w:r>
           </w:p>
@@ -4801,6 +4548,13 @@
               </w:rPr>
             </w:pPr>
             <w:r>
+              <w:rPr>
+                <w:rFonts w:ascii="PT Sans" w:hAnsi="PT Sans" w:cstheme="minorHAnsi"/>
+                <w:color w:val="000000" w:themeColor="text1"/>
+                <w:sz w:val="22"/>
+                <w:szCs w:val="22"/>
+                <w:lang w:val="ru-RU"/>
+              </w:rPr>
               <w:t/>
             </w:r>
           </w:p>
@@ -4827,6 +4581,13 @@
               </w:rPr>
             </w:pPr>
             <w:r>
+              <w:rPr>
+                <w:rFonts w:ascii="PT Sans" w:hAnsi="PT Sans" w:cstheme="minorHAnsi"/>
+                <w:color w:val="000000" w:themeColor="text1"/>
+                <w:sz w:val="22"/>
+                <w:szCs w:val="22"/>
+                <w:lang w:val="ru-RU"/>
+              </w:rPr>
               <w:t/>
             </w:r>
           </w:p>
@@ -4859,6 +4620,13 @@
               </w:rPr>
             </w:pPr>
             <w:r>
+              <w:rPr>
+                <w:rFonts w:ascii="PT Sans" w:hAnsi="PT Sans" w:cstheme="minorHAnsi"/>
+                <w:color w:val="000000" w:themeColor="text1"/>
+                <w:sz w:val="22"/>
+                <w:szCs w:val="22"/>
+                <w:lang w:val="ru-RU"/>
+              </w:rPr>
               <w:t>{{ item.name }}</w:t>
             </w:r>
           </w:p>
@@ -4885,6 +4653,13 @@
               </w:rPr>
             </w:pPr>
             <w:r>
+              <w:rPr>
+                <w:rFonts w:ascii="PT Sans" w:hAnsi="PT Sans" w:cstheme="minorHAnsi"/>
+                <w:color w:val="000000" w:themeColor="text1"/>
+                <w:sz w:val="22"/>
+                <w:szCs w:val="22"/>
+                <w:lang w:val="ru-RU"/>
+              </w:rPr>
               <w:t>{{ item.price }}</w:t>
             </w:r>
           </w:p>
@@ -4911,6 +4686,13 @@
               </w:rPr>
             </w:pPr>
             <w:r>
+              <w:rPr>
+                <w:rFonts w:ascii="PT Sans" w:hAnsi="PT Sans" w:cstheme="minorHAnsi"/>
+                <w:color w:val="000000" w:themeColor="text1"/>
+                <w:sz w:val="22"/>
+                <w:szCs w:val="22"/>
+                <w:lang w:val="ru-RU"/>
+              </w:rPr>
               <w:t>{{ item.term_days }}</w:t>
             </w:r>
           </w:p>
@@ -4943,6 +4725,13 @@
               </w:rPr>
             </w:pPr>
             <w:r>
+              <w:rPr>
+                <w:rFonts w:ascii="PT Sans" w:hAnsi="PT Sans" w:cstheme="minorHAnsi"/>
+                <w:color w:val="000000" w:themeColor="text1"/>
+                <w:sz w:val="22"/>
+                <w:szCs w:val="22"/>
+                <w:lang w:val="ru-RU"/>
+              </w:rPr>
               <w:t>{%tr endfor %}</w:t>
             </w:r>
           </w:p>
@@ -4969,6 +4758,13 @@
               </w:rPr>
             </w:pPr>
             <w:r>
+              <w:rPr>
+                <w:rFonts w:ascii="PT Sans" w:hAnsi="PT Sans" w:cstheme="minorHAnsi"/>
+                <w:color w:val="000000" w:themeColor="text1"/>
+                <w:sz w:val="22"/>
+                <w:szCs w:val="22"/>
+                <w:lang w:val="ru-RU"/>
+              </w:rPr>
               <w:t/>
             </w:r>
           </w:p>
@@ -4995,6 +4791,13 @@
               </w:rPr>
             </w:pPr>
             <w:r>
+              <w:rPr>
+                <w:rFonts w:ascii="PT Sans" w:hAnsi="PT Sans" w:cstheme="minorHAnsi"/>
+                <w:color w:val="000000" w:themeColor="text1"/>
+                <w:sz w:val="22"/>
+                <w:szCs w:val="22"/>
+                <w:lang w:val="ru-RU"/>
+              </w:rPr>
               <w:t/>
             </w:r>
           </w:p>
@@ -5198,10 +5001,6 @@
     <w:p>
       <w:pPr>
         <w:pStyle w:val="a7"/>
-        <w:numPr>
-          <w:ilvl w:val="0"/>
-          <w:numId w:val="15"/>
-        </w:numPr>
         <w:rPr>
           <w:szCs w:val="22"/>
           <w:lang w:val="ru-RU"/>
@@ -5215,13 +5014,10 @@
         <w:t>{{ payment_terms_block }}</w:t>
       </w:r>
     </w:p>
+    <w:p/>
+    <w:p/>
     <w:p>
       <w:pPr>
-        <w:pStyle w:val="a7"/>
-        <w:numPr>
-          <w:ilvl w:val="0"/>
-          <w:numId w:val="15"/>
-        </w:numPr>
         <w:rPr>
           <w:szCs w:val="22"/>
           <w:lang w:val="ru-RU"/>
@@ -5229,6 +5025,8 @@
       </w:pPr>
       <w:r>
         <w:rPr>
+          <w:rFonts w:ascii="PT Sans" w:hAnsi="PT Sans" w:cs="PT Sans"/>
+          <w:b/>
           <w:szCs w:val="22"/>
           <w:lang w:val="ru-RU"/>
         </w:rPr>

</xml_diff>